<commit_message>
edit [worksheet - w7]
</commit_message>
<xml_diff>
--- a/1-G-1/3-week-3/4-worksheet/Computer Worksheet G1 W3.docx
+++ b/1-G-1/3-week-3/4-worksheet/Computer Worksheet G1 W3.docx
@@ -292,7 +292,7 @@
             <w:pPr>
               <w:jc w:val="center"/>
               <w:rPr>
-                <w:rFonts w:ascii="Comic Sans MS" w:hAnsi="Comic Sans MS" w:hint="cs"/>
+                <w:rFonts w:ascii="Comic Sans MS" w:hAnsi="Comic Sans MS"/>
                 <w:b/>
                 <w:bCs/>
                 <w:sz w:val="28"/>
@@ -502,503 +502,13 @@
         <mc:AlternateContent>
           <mc:Choice Requires="wps">
             <w:drawing>
-              <wp:anchor distT="0" distB="0" distL="114300" distR="114300" simplePos="0" relativeHeight="251657216" behindDoc="0" locked="0" layoutInCell="1" allowOverlap="1" wp14:anchorId="0A0B2530" wp14:editId="086D7763">
-                <wp:simplePos x="0" y="0"/>
-                <wp:positionH relativeFrom="column">
-                  <wp:posOffset>2223135</wp:posOffset>
-                </wp:positionH>
-                <wp:positionV relativeFrom="paragraph">
-                  <wp:posOffset>383540</wp:posOffset>
-                </wp:positionV>
-                <wp:extent cx="914400" cy="468086"/>
-                <wp:effectExtent l="0" t="0" r="19050" b="27305"/>
-                <wp:wrapNone/>
-                <wp:docPr id="1513546051" name="Rectangle: Rounded Corners 8"/>
-                <wp:cNvGraphicFramePr/>
-                <a:graphic xmlns:a="http://schemas.openxmlformats.org/drawingml/2006/main">
-                  <a:graphicData uri="http://schemas.microsoft.com/office/word/2010/wordprocessingShape">
-                    <wps:wsp>
-                      <wps:cNvSpPr/>
-                      <wps:spPr>
-                        <a:xfrm>
-                          <a:off x="0" y="0"/>
-                          <a:ext cx="914400" cy="468086"/>
-                        </a:xfrm>
-                        <a:prstGeom prst="roundRect">
-                          <a:avLst/>
-                        </a:prstGeom>
-                      </wps:spPr>
-                      <wps:style>
-                        <a:lnRef idx="2">
-                          <a:schemeClr val="accent1">
-                            <a:shade val="15000"/>
-                          </a:schemeClr>
-                        </a:lnRef>
-                        <a:fillRef idx="1">
-                          <a:schemeClr val="accent1"/>
-                        </a:fillRef>
-                        <a:effectRef idx="0">
-                          <a:schemeClr val="accent1"/>
-                        </a:effectRef>
-                        <a:fontRef idx="minor">
-                          <a:schemeClr val="lt1"/>
-                        </a:fontRef>
-                      </wps:style>
-                      <wps:txbx>
-                        <w:txbxContent>
-                          <w:p>
-                            <w:pPr>
-                              <w:jc w:val="center"/>
-                              <w:rPr>
-                                <w:lang w:bidi="ar-EG"/>
-                              </w:rPr>
-                            </w:pPr>
-                            <w:r>
-                              <w:rPr>
-                                <w:lang w:bidi="ar-EG"/>
-                              </w:rPr>
-                              <w:t>Laptop</w:t>
-                            </w:r>
-                          </w:p>
-                        </w:txbxContent>
-                      </wps:txbx>
-                      <wps:bodyPr rot="0" spcFirstLastPara="0" vertOverflow="overflow" horzOverflow="overflow" vert="horz" wrap="square" lIns="91440" tIns="45720" rIns="91440" bIns="45720" numCol="1" spcCol="0" rtlCol="1" fromWordArt="0" anchor="ctr" anchorCtr="0" forceAA="0" compatLnSpc="1">
-                        <a:prstTxWarp prst="textNoShape">
-                          <a:avLst/>
-                        </a:prstTxWarp>
-                        <a:noAutofit/>
-                      </wps:bodyPr>
-                    </wps:wsp>
-                  </a:graphicData>
-                </a:graphic>
-                <wp14:sizeRelV relativeFrom="margin">
-                  <wp14:pctHeight>0</wp14:pctHeight>
-                </wp14:sizeRelV>
-              </wp:anchor>
-            </w:drawing>
-          </mc:Choice>
-          <mc:Fallback>
-            <w:pict>
-              <v:roundrect w14:anchorId="0A0B2530" id="Rectangle: Rounded Corners 8" o:spid="_x0000_s1026" style="position:absolute;margin-left:175.05pt;margin-top:30.2pt;width:1in;height:36.85pt;z-index:251657216;visibility:visible;mso-wrap-style:square;mso-height-percent:0;mso-wrap-distance-left:9pt;mso-wrap-distance-top:0;mso-wrap-distance-right:9pt;mso-wrap-distance-bottom:0;mso-position-horizontal:absolute;mso-position-horizontal-relative:text;mso-position-vertical:absolute;mso-position-vertical-relative:text;mso-height-percent:0;mso-height-relative:margin;v-text-anchor:middle" arcsize="10923f" o:gfxdata="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" fillcolor="#4f81bd [3204]" strokecolor="#0a121c [484]" strokeweight="2pt">
-                <v:textbox>
-                  <w:txbxContent>
-                    <w:p>
-                      <w:pPr>
-                        <w:jc w:val="center"/>
-                        <w:rPr>
-                          <w:lang w:bidi="ar-EG"/>
-                        </w:rPr>
-                      </w:pPr>
-                      <w:r>
-                        <w:rPr>
-                          <w:lang w:bidi="ar-EG"/>
-                        </w:rPr>
-                        <w:t>Laptop</w:t>
-                      </w:r>
-                    </w:p>
-                  </w:txbxContent>
-                </v:textbox>
-              </v:roundrect>
-            </w:pict>
-          </mc:Fallback>
-        </mc:AlternateContent>
-      </w:r>
-      <w:r>
-        <w:rPr>
-          <w:rFonts w:ascii="Lucida Bright" w:hAnsi="Lucida Bright"/>
-          <w:noProof/>
-          <w:sz w:val="36"/>
-          <w:szCs w:val="36"/>
-        </w:rPr>
-        <mc:AlternateContent>
-          <mc:Choice Requires="wps">
-            <w:drawing>
-              <wp:anchor distT="0" distB="0" distL="114300" distR="114300" simplePos="0" relativeHeight="251661312" behindDoc="0" locked="0" layoutInCell="1" allowOverlap="1" wp14:anchorId="4B0C41B8" wp14:editId="3E70D971">
-                <wp:simplePos x="0" y="0"/>
-                <wp:positionH relativeFrom="column">
-                  <wp:posOffset>3459480</wp:posOffset>
-                </wp:positionH>
-                <wp:positionV relativeFrom="paragraph">
-                  <wp:posOffset>383540</wp:posOffset>
-                </wp:positionV>
-                <wp:extent cx="914400" cy="467995"/>
-                <wp:effectExtent l="0" t="0" r="19050" b="27305"/>
-                <wp:wrapNone/>
-                <wp:docPr id="56520592" name="Rectangle: Rounded Corners 8"/>
-                <wp:cNvGraphicFramePr/>
-                <a:graphic xmlns:a="http://schemas.openxmlformats.org/drawingml/2006/main">
-                  <a:graphicData uri="http://schemas.microsoft.com/office/word/2010/wordprocessingShape">
-                    <wps:wsp>
-                      <wps:cNvSpPr/>
-                      <wps:spPr>
-                        <a:xfrm>
-                          <a:off x="0" y="0"/>
-                          <a:ext cx="914400" cy="467995"/>
-                        </a:xfrm>
-                        <a:prstGeom prst="roundRect">
-                          <a:avLst/>
-                        </a:prstGeom>
-                      </wps:spPr>
-                      <wps:style>
-                        <a:lnRef idx="2">
-                          <a:schemeClr val="accent1">
-                            <a:shade val="15000"/>
-                          </a:schemeClr>
-                        </a:lnRef>
-                        <a:fillRef idx="1">
-                          <a:schemeClr val="accent1"/>
-                        </a:fillRef>
-                        <a:effectRef idx="0">
-                          <a:schemeClr val="accent1"/>
-                        </a:effectRef>
-                        <a:fontRef idx="minor">
-                          <a:schemeClr val="lt1"/>
-                        </a:fontRef>
-                      </wps:style>
-                      <wps:txbx>
-                        <w:txbxContent>
-                          <w:p>
-                            <w:pPr>
-                              <w:jc w:val="center"/>
-                              <w:rPr>
-                                <w:lang w:bidi="ar-EG"/>
-                              </w:rPr>
-                            </w:pPr>
-                            <w:r>
-                              <w:rPr>
-                                <w:lang w:bidi="ar-EG"/>
-                              </w:rPr>
-                              <w:t>Tablet</w:t>
-                            </w:r>
-                          </w:p>
-                        </w:txbxContent>
-                      </wps:txbx>
-                      <wps:bodyPr rot="0" spcFirstLastPara="0" vertOverflow="overflow" horzOverflow="overflow" vert="horz" wrap="square" lIns="91440" tIns="45720" rIns="91440" bIns="45720" numCol="1" spcCol="0" rtlCol="1" fromWordArt="0" anchor="ctr" anchorCtr="0" forceAA="0" compatLnSpc="1">
-                        <a:prstTxWarp prst="textNoShape">
-                          <a:avLst/>
-                        </a:prstTxWarp>
-                        <a:noAutofit/>
-                      </wps:bodyPr>
-                    </wps:wsp>
-                  </a:graphicData>
-                </a:graphic>
-                <wp14:sizeRelV relativeFrom="margin">
-                  <wp14:pctHeight>0</wp14:pctHeight>
-                </wp14:sizeRelV>
-              </wp:anchor>
-            </w:drawing>
-          </mc:Choice>
-          <mc:Fallback>
-            <w:pict>
-              <v:roundrect w14:anchorId="4B0C41B8" id="_x0000_s1027" style="position:absolute;margin-left:272.4pt;margin-top:30.2pt;width:1in;height:36.85pt;z-index:251661312;visibility:visible;mso-wrap-style:square;mso-height-percent:0;mso-wrap-distance-left:9pt;mso-wrap-distance-top:0;mso-wrap-distance-right:9pt;mso-wrap-distance-bottom:0;mso-position-horizontal:absolute;mso-position-horizontal-relative:text;mso-position-vertical:absolute;mso-position-vertical-relative:text;mso-height-percent:0;mso-height-relative:margin;v-text-anchor:middle" arcsize="10923f" o:gfxdata="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" fillcolor="#4f81bd [3204]" strokecolor="#0a121c [484]" strokeweight="2pt">
-                <v:textbox>
-                  <w:txbxContent>
-                    <w:p>
-                      <w:pPr>
-                        <w:jc w:val="center"/>
-                        <w:rPr>
-                          <w:lang w:bidi="ar-EG"/>
-                        </w:rPr>
-                      </w:pPr>
-                      <w:r>
-                        <w:rPr>
-                          <w:lang w:bidi="ar-EG"/>
-                        </w:rPr>
-                        <w:t>Tablet</w:t>
-                      </w:r>
-                    </w:p>
-                  </w:txbxContent>
-                </v:textbox>
-              </v:roundrect>
-            </w:pict>
-          </mc:Fallback>
-        </mc:AlternateContent>
-      </w:r>
-      <w:r>
-        <w:rPr>
-          <w:rFonts w:ascii="Lucida Bright" w:hAnsi="Lucida Bright"/>
-          <w:noProof/>
-          <w:sz w:val="36"/>
-          <w:szCs w:val="36"/>
-        </w:rPr>
-        <mc:AlternateContent>
-          <mc:Choice Requires="wps">
-            <w:drawing>
-              <wp:anchor distT="0" distB="0" distL="114300" distR="114300" simplePos="0" relativeHeight="251669504" behindDoc="0" locked="0" layoutInCell="1" allowOverlap="1" wp14:anchorId="31939CC7" wp14:editId="58F2F284">
-                <wp:simplePos x="0" y="0"/>
-                <wp:positionH relativeFrom="column">
-                  <wp:posOffset>536030</wp:posOffset>
-                </wp:positionH>
-                <wp:positionV relativeFrom="paragraph">
-                  <wp:posOffset>2995386</wp:posOffset>
-                </wp:positionV>
-                <wp:extent cx="1687286" cy="0"/>
-                <wp:effectExtent l="57150" t="38100" r="65405" b="95250"/>
-                <wp:wrapNone/>
-                <wp:docPr id="1478695497" name="Straight Connector 9"/>
-                <wp:cNvGraphicFramePr/>
-                <a:graphic xmlns:a="http://schemas.openxmlformats.org/drawingml/2006/main">
-                  <a:graphicData uri="http://schemas.microsoft.com/office/word/2010/wordprocessingShape">
-                    <wps:wsp>
-                      <wps:cNvCnPr/>
-                      <wps:spPr>
-                        <a:xfrm>
-                          <a:off x="0" y="0"/>
-                          <a:ext cx="1687286" cy="0"/>
-                        </a:xfrm>
-                        <a:prstGeom prst="line">
-                          <a:avLst/>
-                        </a:prstGeom>
-                      </wps:spPr>
-                      <wps:style>
-                        <a:lnRef idx="3">
-                          <a:schemeClr val="dk1"/>
-                        </a:lnRef>
-                        <a:fillRef idx="0">
-                          <a:schemeClr val="dk1"/>
-                        </a:fillRef>
-                        <a:effectRef idx="2">
-                          <a:schemeClr val="dk1"/>
-                        </a:effectRef>
-                        <a:fontRef idx="minor">
-                          <a:schemeClr val="tx1"/>
-                        </a:fontRef>
-                      </wps:style>
-                      <wps:bodyPr/>
-                    </wps:wsp>
-                  </a:graphicData>
-                </a:graphic>
-              </wp:anchor>
-            </w:drawing>
-          </mc:Choice>
-          <mc:Fallback>
-            <w:pict>
-              <v:line w14:anchorId="3CE9118D" id="Straight Connector 9" o:spid="_x0000_s1026" style="position:absolute;left:0;text-align:left;z-index:251669504;visibility:visible;mso-wrap-style:square;mso-wrap-distance-left:9pt;mso-wrap-distance-top:0;mso-wrap-distance-right:9pt;mso-wrap-distance-bottom:0;mso-position-horizontal:absolute;mso-position-horizontal-relative:text;mso-position-vertical:absolute;mso-position-vertical-relative:text" from="42.2pt,235.85pt" to="175.05pt,235.85pt" o:gfxdata="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" strokecolor="black [3200]" strokeweight="3pt">
-                <v:shadow on="t" color="black" opacity="22937f" origin=",.5" offset="0,.63889mm"/>
-              </v:line>
-            </w:pict>
-          </mc:Fallback>
-        </mc:AlternateContent>
-      </w:r>
-      <w:r>
-        <w:rPr>
-          <w:rFonts w:ascii="Lucida Bright" w:hAnsi="Lucida Bright"/>
-          <w:noProof/>
-          <w:sz w:val="36"/>
-          <w:szCs w:val="36"/>
-        </w:rPr>
-        <mc:AlternateContent>
-          <mc:Choice Requires="wps">
-            <w:drawing>
-              <wp:anchor distT="0" distB="0" distL="114300" distR="114300" simplePos="0" relativeHeight="251681792" behindDoc="0" locked="0" layoutInCell="1" allowOverlap="1" wp14:anchorId="7875B88C" wp14:editId="57857D5A">
-                <wp:simplePos x="0" y="0"/>
-                <wp:positionH relativeFrom="column">
-                  <wp:posOffset>4604385</wp:posOffset>
-                </wp:positionH>
-                <wp:positionV relativeFrom="paragraph">
-                  <wp:posOffset>2996474</wp:posOffset>
-                </wp:positionV>
-                <wp:extent cx="1687286" cy="0"/>
-                <wp:effectExtent l="57150" t="38100" r="65405" b="95250"/>
-                <wp:wrapNone/>
-                <wp:docPr id="1059584092" name="Straight Connector 9"/>
-                <wp:cNvGraphicFramePr/>
-                <a:graphic xmlns:a="http://schemas.openxmlformats.org/drawingml/2006/main">
-                  <a:graphicData uri="http://schemas.microsoft.com/office/word/2010/wordprocessingShape">
-                    <wps:wsp>
-                      <wps:cNvCnPr/>
-                      <wps:spPr>
-                        <a:xfrm>
-                          <a:off x="0" y="0"/>
-                          <a:ext cx="1687286" cy="0"/>
-                        </a:xfrm>
-                        <a:prstGeom prst="line">
-                          <a:avLst/>
-                        </a:prstGeom>
-                      </wps:spPr>
-                      <wps:style>
-                        <a:lnRef idx="3">
-                          <a:schemeClr val="dk1"/>
-                        </a:lnRef>
-                        <a:fillRef idx="0">
-                          <a:schemeClr val="dk1"/>
-                        </a:fillRef>
-                        <a:effectRef idx="2">
-                          <a:schemeClr val="dk1"/>
-                        </a:effectRef>
-                        <a:fontRef idx="minor">
-                          <a:schemeClr val="tx1"/>
-                        </a:fontRef>
-                      </wps:style>
-                      <wps:bodyPr/>
-                    </wps:wsp>
-                  </a:graphicData>
-                </a:graphic>
-              </wp:anchor>
-            </w:drawing>
-          </mc:Choice>
-          <mc:Fallback>
-            <w:pict>
-              <v:line w14:anchorId="00131FCF" id="Straight Connector 9" o:spid="_x0000_s1026" style="position:absolute;left:0;text-align:left;z-index:251681792;visibility:visible;mso-wrap-style:square;mso-wrap-distance-left:9pt;mso-wrap-distance-top:0;mso-wrap-distance-right:9pt;mso-wrap-distance-bottom:0;mso-position-horizontal:absolute;mso-position-horizontal-relative:text;mso-position-vertical:absolute;mso-position-vertical-relative:text" from="362.55pt,235.95pt" to="495.4pt,235.95pt" o:gfxdata="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" strokecolor="black [3200]" strokeweight="3pt">
-                <v:shadow on="t" color="black" opacity="22937f" origin=",.5" offset="0,.63889mm"/>
-              </v:line>
-            </w:pict>
-          </mc:Fallback>
-        </mc:AlternateContent>
-      </w:r>
-      <w:r>
-        <w:rPr>
-          <w:rFonts w:ascii="Lucida Bright" w:hAnsi="Lucida Bright"/>
-          <w:noProof/>
-          <w:sz w:val="36"/>
-          <w:szCs w:val="36"/>
-        </w:rPr>
-        <w:drawing>
-          <wp:anchor distT="0" distB="0" distL="114300" distR="114300" simplePos="0" relativeHeight="251644928" behindDoc="0" locked="0" layoutInCell="1" allowOverlap="1" wp14:anchorId="2AFFD219" wp14:editId="35932DFC">
-            <wp:simplePos x="0" y="0"/>
-            <wp:positionH relativeFrom="column">
-              <wp:posOffset>4607016</wp:posOffset>
-            </wp:positionH>
-            <wp:positionV relativeFrom="paragraph">
-              <wp:posOffset>3469550</wp:posOffset>
-            </wp:positionV>
-            <wp:extent cx="2022838" cy="1136653"/>
-            <wp:effectExtent l="0" t="0" r="0" b="6350"/>
-            <wp:wrapNone/>
-            <wp:docPr id="825067895" name="Picture 5"/>
-            <wp:cNvGraphicFramePr>
-              <a:graphicFrameLocks xmlns:a="http://schemas.openxmlformats.org/drawingml/2006/main" noChangeAspect="1"/>
-            </wp:cNvGraphicFramePr>
-            <a:graphic xmlns:a="http://schemas.openxmlformats.org/drawingml/2006/main">
-              <a:graphicData uri="http://schemas.openxmlformats.org/drawingml/2006/picture">
-                <pic:pic xmlns:pic="http://schemas.openxmlformats.org/drawingml/2006/picture">
-                  <pic:nvPicPr>
-                    <pic:cNvPr id="0" name="Picture 5"/>
-                    <pic:cNvPicPr>
-                      <a:picLocks noChangeAspect="1" noChangeArrowheads="1"/>
-                    </pic:cNvPicPr>
-                  </pic:nvPicPr>
-                  <pic:blipFill>
-                    <a:blip r:embed="rId7" cstate="print">
-                      <a:extLst>
-                        <a:ext uri="{28A0092B-C50C-407E-A947-70E740481C1C}">
-                          <a14:useLocalDpi xmlns:a14="http://schemas.microsoft.com/office/drawing/2010/main" val="0"/>
-                        </a:ext>
-                      </a:extLst>
-                    </a:blip>
-                    <a:srcRect/>
-                    <a:stretch>
-                      <a:fillRect/>
-                    </a:stretch>
-                  </pic:blipFill>
-                  <pic:spPr bwMode="auto">
-                    <a:xfrm>
-                      <a:off x="0" y="0"/>
-                      <a:ext cx="2022838" cy="1136653"/>
-                    </a:xfrm>
-                    <a:prstGeom prst="rect">
-                      <a:avLst/>
-                    </a:prstGeom>
-                    <a:noFill/>
-                    <a:ln>
-                      <a:noFill/>
-                    </a:ln>
-                  </pic:spPr>
-                </pic:pic>
-              </a:graphicData>
-            </a:graphic>
-            <wp14:sizeRelH relativeFrom="margin">
-              <wp14:pctWidth>0</wp14:pctWidth>
-            </wp14:sizeRelH>
-            <wp14:sizeRelV relativeFrom="margin">
-              <wp14:pctHeight>0</wp14:pctHeight>
-            </wp14:sizeRelV>
-          </wp:anchor>
-        </w:drawing>
-      </w:r>
-      <w:r>
-        <w:rPr>
-          <w:rFonts w:ascii="Lucida Bright" w:hAnsi="Lucida Bright"/>
-          <w:noProof/>
-          <w:sz w:val="36"/>
-          <w:szCs w:val="36"/>
-        </w:rPr>
-        <mc:AlternateContent>
-          <mc:Choice Requires="wps">
-            <w:drawing>
-              <wp:anchor distT="0" distB="0" distL="114300" distR="114300" simplePos="0" relativeHeight="251677696" behindDoc="0" locked="0" layoutInCell="1" allowOverlap="1" wp14:anchorId="0124B21A" wp14:editId="2C5AAED1">
-                <wp:simplePos x="0" y="0"/>
-                <wp:positionH relativeFrom="column">
-                  <wp:posOffset>4607288</wp:posOffset>
-                </wp:positionH>
-                <wp:positionV relativeFrom="paragraph">
-                  <wp:posOffset>5124450</wp:posOffset>
-                </wp:positionV>
-                <wp:extent cx="1687286" cy="0"/>
-                <wp:effectExtent l="57150" t="38100" r="65405" b="95250"/>
-                <wp:wrapNone/>
-                <wp:docPr id="934568660" name="Straight Connector 9"/>
-                <wp:cNvGraphicFramePr/>
-                <a:graphic xmlns:a="http://schemas.openxmlformats.org/drawingml/2006/main">
-                  <a:graphicData uri="http://schemas.microsoft.com/office/word/2010/wordprocessingShape">
-                    <wps:wsp>
-                      <wps:cNvCnPr/>
-                      <wps:spPr>
-                        <a:xfrm>
-                          <a:off x="0" y="0"/>
-                          <a:ext cx="1687286" cy="0"/>
-                        </a:xfrm>
-                        <a:prstGeom prst="line">
-                          <a:avLst/>
-                        </a:prstGeom>
-                      </wps:spPr>
-                      <wps:style>
-                        <a:lnRef idx="3">
-                          <a:schemeClr val="dk1"/>
-                        </a:lnRef>
-                        <a:fillRef idx="0">
-                          <a:schemeClr val="dk1"/>
-                        </a:fillRef>
-                        <a:effectRef idx="2">
-                          <a:schemeClr val="dk1"/>
-                        </a:effectRef>
-                        <a:fontRef idx="minor">
-                          <a:schemeClr val="tx1"/>
-                        </a:fontRef>
-                      </wps:style>
-                      <wps:bodyPr/>
-                    </wps:wsp>
-                  </a:graphicData>
-                </a:graphic>
-              </wp:anchor>
-            </w:drawing>
-          </mc:Choice>
-          <mc:Fallback>
-            <w:pict>
-              <v:line w14:anchorId="54FA2EC2" id="Straight Connector 9" o:spid="_x0000_s1026" style="position:absolute;left:0;text-align:left;z-index:251677696;visibility:visible;mso-wrap-style:square;mso-wrap-distance-left:9pt;mso-wrap-distance-top:0;mso-wrap-distance-right:9pt;mso-wrap-distance-bottom:0;mso-position-horizontal:absolute;mso-position-horizontal-relative:text;mso-position-vertical:absolute;mso-position-vertical-relative:text" from="362.8pt,403.5pt" to="495.65pt,403.5pt" o:gfxdata="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" strokecolor="black [3200]" strokeweight="3pt">
-                <v:shadow on="t" color="black" opacity="22937f" origin=",.5" offset="0,.63889mm"/>
-              </v:line>
-            </w:pict>
-          </mc:Fallback>
-        </mc:AlternateContent>
-      </w:r>
-      <w:r>
-        <w:rPr>
-          <w:rFonts w:ascii="Lucida Bright" w:hAnsi="Lucida Bright"/>
-          <w:noProof/>
-          <w:sz w:val="36"/>
-          <w:szCs w:val="36"/>
-        </w:rPr>
-        <mc:AlternateContent>
-          <mc:Choice Requires="wps">
-            <w:drawing>
-              <wp:anchor distT="45720" distB="45720" distL="114300" distR="114300" simplePos="0" relativeHeight="251636736" behindDoc="0" locked="0" layoutInCell="1" allowOverlap="1" wp14:anchorId="20D99B0E" wp14:editId="45C5A47E">
+              <wp:anchor distT="45720" distB="45720" distL="114300" distR="114300" simplePos="0" relativeHeight="251652096" behindDoc="0" locked="0" layoutInCell="1" allowOverlap="1" wp14:anchorId="20D99B0E" wp14:editId="2BB8470F">
                 <wp:simplePos x="0" y="0"/>
                 <wp:positionH relativeFrom="column">
                   <wp:posOffset>1958975</wp:posOffset>
                 </wp:positionH>
                 <wp:positionV relativeFrom="paragraph">
-                  <wp:posOffset>5424352</wp:posOffset>
+                  <wp:posOffset>5515610</wp:posOffset>
                 </wp:positionV>
                 <wp:extent cx="2360930" cy="1404620"/>
                 <wp:effectExtent l="0" t="0" r="19050" b="24130"/>
@@ -1082,7 +592,7 @@
                 <v:stroke joinstyle="miter"/>
                 <v:path gradientshapeok="t" o:connecttype="rect"/>
               </v:shapetype>
-              <v:shape id="Text Box 2" o:spid="_x0000_s1028" type="#_x0000_t202" style="position:absolute;margin-left:154.25pt;margin-top:427.1pt;width:185.9pt;height:110.6pt;z-index:251636736;visibility:visible;mso-wrap-style:square;mso-width-percent:400;mso-height-percent:200;mso-wrap-distance-left:9pt;mso-wrap-distance-top:3.6pt;mso-wrap-distance-right:9pt;mso-wrap-distance-bottom:3.6pt;mso-position-horizontal:absolute;mso-position-horizontal-relative:text;mso-position-vertical:absolute;mso-position-vertical-relative:text;mso-width-percent:400;mso-height-percent:200;mso-width-relative:margin;mso-height-relative:margin;v-text-anchor:top" o:gfxdata="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">
+              <v:shape id="Text Box 2" o:spid="_x0000_s1026" type="#_x0000_t202" style="position:absolute;margin-left:154.25pt;margin-top:434.3pt;width:185.9pt;height:110.6pt;z-index:251652096;visibility:visible;mso-wrap-style:square;mso-width-percent:400;mso-height-percent:200;mso-wrap-distance-left:9pt;mso-wrap-distance-top:3.6pt;mso-wrap-distance-right:9pt;mso-wrap-distance-bottom:3.6pt;mso-position-horizontal:absolute;mso-position-horizontal-relative:text;mso-position-vertical:absolute;mso-position-vertical-relative:text;mso-width-percent:400;mso-height-percent:200;mso-width-relative:margin;mso-height-relative:margin;v-text-anchor:top" o:gfxdata="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">
                 <v:textbox style="mso-fit-shape-to-text:t">
                   <w:txbxContent>
                     <w:p>
@@ -1126,7 +636,497 @@
         <mc:AlternateContent>
           <mc:Choice Requires="wps">
             <w:drawing>
-              <wp:anchor distT="0" distB="0" distL="114300" distR="114300" simplePos="0" relativeHeight="251673600" behindDoc="0" locked="0" layoutInCell="1" allowOverlap="1" wp14:anchorId="7285D0FD" wp14:editId="61FF408C">
+              <wp:anchor distT="0" distB="0" distL="114300" distR="114300" simplePos="0" relativeHeight="251656192" behindDoc="0" locked="0" layoutInCell="1" allowOverlap="1" wp14:anchorId="0A0B2530" wp14:editId="086D7763">
+                <wp:simplePos x="0" y="0"/>
+                <wp:positionH relativeFrom="column">
+                  <wp:posOffset>2223135</wp:posOffset>
+                </wp:positionH>
+                <wp:positionV relativeFrom="paragraph">
+                  <wp:posOffset>383540</wp:posOffset>
+                </wp:positionV>
+                <wp:extent cx="914400" cy="468086"/>
+                <wp:effectExtent l="0" t="0" r="19050" b="27305"/>
+                <wp:wrapNone/>
+                <wp:docPr id="1513546051" name="Rectangle: Rounded Corners 8"/>
+                <wp:cNvGraphicFramePr/>
+                <a:graphic xmlns:a="http://schemas.openxmlformats.org/drawingml/2006/main">
+                  <a:graphicData uri="http://schemas.microsoft.com/office/word/2010/wordprocessingShape">
+                    <wps:wsp>
+                      <wps:cNvSpPr/>
+                      <wps:spPr>
+                        <a:xfrm>
+                          <a:off x="0" y="0"/>
+                          <a:ext cx="914400" cy="468086"/>
+                        </a:xfrm>
+                        <a:prstGeom prst="roundRect">
+                          <a:avLst/>
+                        </a:prstGeom>
+                      </wps:spPr>
+                      <wps:style>
+                        <a:lnRef idx="2">
+                          <a:schemeClr val="accent1">
+                            <a:shade val="15000"/>
+                          </a:schemeClr>
+                        </a:lnRef>
+                        <a:fillRef idx="1">
+                          <a:schemeClr val="accent1"/>
+                        </a:fillRef>
+                        <a:effectRef idx="0">
+                          <a:schemeClr val="accent1"/>
+                        </a:effectRef>
+                        <a:fontRef idx="minor">
+                          <a:schemeClr val="lt1"/>
+                        </a:fontRef>
+                      </wps:style>
+                      <wps:txbx>
+                        <w:txbxContent>
+                          <w:p>
+                            <w:pPr>
+                              <w:jc w:val="center"/>
+                              <w:rPr>
+                                <w:lang w:bidi="ar-EG"/>
+                              </w:rPr>
+                            </w:pPr>
+                            <w:r>
+                              <w:rPr>
+                                <w:lang w:bidi="ar-EG"/>
+                              </w:rPr>
+                              <w:t>Laptop</w:t>
+                            </w:r>
+                          </w:p>
+                        </w:txbxContent>
+                      </wps:txbx>
+                      <wps:bodyPr rot="0" spcFirstLastPara="0" vertOverflow="overflow" horzOverflow="overflow" vert="horz" wrap="square" lIns="91440" tIns="45720" rIns="91440" bIns="45720" numCol="1" spcCol="0" rtlCol="1" fromWordArt="0" anchor="ctr" anchorCtr="0" forceAA="0" compatLnSpc="1">
+                        <a:prstTxWarp prst="textNoShape">
+                          <a:avLst/>
+                        </a:prstTxWarp>
+                        <a:noAutofit/>
+                      </wps:bodyPr>
+                    </wps:wsp>
+                  </a:graphicData>
+                </a:graphic>
+                <wp14:sizeRelV relativeFrom="margin">
+                  <wp14:pctHeight>0</wp14:pctHeight>
+                </wp14:sizeRelV>
+              </wp:anchor>
+            </w:drawing>
+          </mc:Choice>
+          <mc:Fallback>
+            <w:pict>
+              <v:roundrect w14:anchorId="0A0B2530" id="Rectangle: Rounded Corners 8" o:spid="_x0000_s1027" style="position:absolute;margin-left:175.05pt;margin-top:30.2pt;width:1in;height:36.85pt;z-index:251656192;visibility:visible;mso-wrap-style:square;mso-height-percent:0;mso-wrap-distance-left:9pt;mso-wrap-distance-top:0;mso-wrap-distance-right:9pt;mso-wrap-distance-bottom:0;mso-position-horizontal:absolute;mso-position-horizontal-relative:text;mso-position-vertical:absolute;mso-position-vertical-relative:text;mso-height-percent:0;mso-height-relative:margin;v-text-anchor:middle" arcsize="10923f" o:gfxdata="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" fillcolor="#4f81bd [3204]" strokecolor="#0a121c [484]" strokeweight="2pt">
+                <v:textbox>
+                  <w:txbxContent>
+                    <w:p>
+                      <w:pPr>
+                        <w:jc w:val="center"/>
+                        <w:rPr>
+                          <w:lang w:bidi="ar-EG"/>
+                        </w:rPr>
+                      </w:pPr>
+                      <w:r>
+                        <w:rPr>
+                          <w:lang w:bidi="ar-EG"/>
+                        </w:rPr>
+                        <w:t>Laptop</w:t>
+                      </w:r>
+                    </w:p>
+                  </w:txbxContent>
+                </v:textbox>
+              </v:roundrect>
+            </w:pict>
+          </mc:Fallback>
+        </mc:AlternateContent>
+      </w:r>
+      <w:r>
+        <w:rPr>
+          <w:rFonts w:ascii="Lucida Bright" w:hAnsi="Lucida Bright"/>
+          <w:noProof/>
+          <w:sz w:val="36"/>
+          <w:szCs w:val="36"/>
+        </w:rPr>
+        <mc:AlternateContent>
+          <mc:Choice Requires="wps">
+            <w:drawing>
+              <wp:anchor distT="0" distB="0" distL="114300" distR="114300" simplePos="0" relativeHeight="251658240" behindDoc="0" locked="0" layoutInCell="1" allowOverlap="1" wp14:anchorId="4B0C41B8" wp14:editId="3E70D971">
+                <wp:simplePos x="0" y="0"/>
+                <wp:positionH relativeFrom="column">
+                  <wp:posOffset>3459480</wp:posOffset>
+                </wp:positionH>
+                <wp:positionV relativeFrom="paragraph">
+                  <wp:posOffset>383540</wp:posOffset>
+                </wp:positionV>
+                <wp:extent cx="914400" cy="467995"/>
+                <wp:effectExtent l="0" t="0" r="19050" b="27305"/>
+                <wp:wrapNone/>
+                <wp:docPr id="56520592" name="Rectangle: Rounded Corners 8"/>
+                <wp:cNvGraphicFramePr/>
+                <a:graphic xmlns:a="http://schemas.openxmlformats.org/drawingml/2006/main">
+                  <a:graphicData uri="http://schemas.microsoft.com/office/word/2010/wordprocessingShape">
+                    <wps:wsp>
+                      <wps:cNvSpPr/>
+                      <wps:spPr>
+                        <a:xfrm>
+                          <a:off x="0" y="0"/>
+                          <a:ext cx="914400" cy="467995"/>
+                        </a:xfrm>
+                        <a:prstGeom prst="roundRect">
+                          <a:avLst/>
+                        </a:prstGeom>
+                      </wps:spPr>
+                      <wps:style>
+                        <a:lnRef idx="2">
+                          <a:schemeClr val="accent1">
+                            <a:shade val="15000"/>
+                          </a:schemeClr>
+                        </a:lnRef>
+                        <a:fillRef idx="1">
+                          <a:schemeClr val="accent1"/>
+                        </a:fillRef>
+                        <a:effectRef idx="0">
+                          <a:schemeClr val="accent1"/>
+                        </a:effectRef>
+                        <a:fontRef idx="minor">
+                          <a:schemeClr val="lt1"/>
+                        </a:fontRef>
+                      </wps:style>
+                      <wps:txbx>
+                        <w:txbxContent>
+                          <w:p>
+                            <w:pPr>
+                              <w:jc w:val="center"/>
+                              <w:rPr>
+                                <w:lang w:bidi="ar-EG"/>
+                              </w:rPr>
+                            </w:pPr>
+                            <w:r>
+                              <w:rPr>
+                                <w:lang w:bidi="ar-EG"/>
+                              </w:rPr>
+                              <w:t>Tablet</w:t>
+                            </w:r>
+                          </w:p>
+                        </w:txbxContent>
+                      </wps:txbx>
+                      <wps:bodyPr rot="0" spcFirstLastPara="0" vertOverflow="overflow" horzOverflow="overflow" vert="horz" wrap="square" lIns="91440" tIns="45720" rIns="91440" bIns="45720" numCol="1" spcCol="0" rtlCol="1" fromWordArt="0" anchor="ctr" anchorCtr="0" forceAA="0" compatLnSpc="1">
+                        <a:prstTxWarp prst="textNoShape">
+                          <a:avLst/>
+                        </a:prstTxWarp>
+                        <a:noAutofit/>
+                      </wps:bodyPr>
+                    </wps:wsp>
+                  </a:graphicData>
+                </a:graphic>
+                <wp14:sizeRelV relativeFrom="margin">
+                  <wp14:pctHeight>0</wp14:pctHeight>
+                </wp14:sizeRelV>
+              </wp:anchor>
+            </w:drawing>
+          </mc:Choice>
+          <mc:Fallback>
+            <w:pict>
+              <v:roundrect w14:anchorId="4B0C41B8" id="_x0000_s1028" style="position:absolute;margin-left:272.4pt;margin-top:30.2pt;width:1in;height:36.85pt;z-index:251658240;visibility:visible;mso-wrap-style:square;mso-height-percent:0;mso-wrap-distance-left:9pt;mso-wrap-distance-top:0;mso-wrap-distance-right:9pt;mso-wrap-distance-bottom:0;mso-position-horizontal:absolute;mso-position-horizontal-relative:text;mso-position-vertical:absolute;mso-position-vertical-relative:text;mso-height-percent:0;mso-height-relative:margin;v-text-anchor:middle" arcsize="10923f" o:gfxdata="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" fillcolor="#4f81bd [3204]" strokecolor="#0a121c [484]" strokeweight="2pt">
+                <v:textbox>
+                  <w:txbxContent>
+                    <w:p>
+                      <w:pPr>
+                        <w:jc w:val="center"/>
+                        <w:rPr>
+                          <w:lang w:bidi="ar-EG"/>
+                        </w:rPr>
+                      </w:pPr>
+                      <w:r>
+                        <w:rPr>
+                          <w:lang w:bidi="ar-EG"/>
+                        </w:rPr>
+                        <w:t>Tablet</w:t>
+                      </w:r>
+                    </w:p>
+                  </w:txbxContent>
+                </v:textbox>
+              </v:roundrect>
+            </w:pict>
+          </mc:Fallback>
+        </mc:AlternateContent>
+      </w:r>
+      <w:r>
+        <w:rPr>
+          <w:rFonts w:ascii="Lucida Bright" w:hAnsi="Lucida Bright"/>
+          <w:noProof/>
+          <w:sz w:val="36"/>
+          <w:szCs w:val="36"/>
+        </w:rPr>
+        <mc:AlternateContent>
+          <mc:Choice Requires="wps">
+            <w:drawing>
+              <wp:anchor distT="0" distB="0" distL="114300" distR="114300" simplePos="0" relativeHeight="251660288" behindDoc="0" locked="0" layoutInCell="1" allowOverlap="1" wp14:anchorId="31939CC7" wp14:editId="58F2F284">
+                <wp:simplePos x="0" y="0"/>
+                <wp:positionH relativeFrom="column">
+                  <wp:posOffset>536030</wp:posOffset>
+                </wp:positionH>
+                <wp:positionV relativeFrom="paragraph">
+                  <wp:posOffset>2995386</wp:posOffset>
+                </wp:positionV>
+                <wp:extent cx="1687286" cy="0"/>
+                <wp:effectExtent l="57150" t="38100" r="65405" b="95250"/>
+                <wp:wrapNone/>
+                <wp:docPr id="1478695497" name="Straight Connector 9"/>
+                <wp:cNvGraphicFramePr/>
+                <a:graphic xmlns:a="http://schemas.openxmlformats.org/drawingml/2006/main">
+                  <a:graphicData uri="http://schemas.microsoft.com/office/word/2010/wordprocessingShape">
+                    <wps:wsp>
+                      <wps:cNvCnPr/>
+                      <wps:spPr>
+                        <a:xfrm>
+                          <a:off x="0" y="0"/>
+                          <a:ext cx="1687286" cy="0"/>
+                        </a:xfrm>
+                        <a:prstGeom prst="line">
+                          <a:avLst/>
+                        </a:prstGeom>
+                      </wps:spPr>
+                      <wps:style>
+                        <a:lnRef idx="3">
+                          <a:schemeClr val="dk1"/>
+                        </a:lnRef>
+                        <a:fillRef idx="0">
+                          <a:schemeClr val="dk1"/>
+                        </a:fillRef>
+                        <a:effectRef idx="2">
+                          <a:schemeClr val="dk1"/>
+                        </a:effectRef>
+                        <a:fontRef idx="minor">
+                          <a:schemeClr val="tx1"/>
+                        </a:fontRef>
+                      </wps:style>
+                      <wps:bodyPr/>
+                    </wps:wsp>
+                  </a:graphicData>
+                </a:graphic>
+              </wp:anchor>
+            </w:drawing>
+          </mc:Choice>
+          <mc:Fallback>
+            <w:pict>
+              <v:line w14:anchorId="665709C7" id="Straight Connector 9" o:spid="_x0000_s1026" style="position:absolute;left:0;text-align:left;z-index:251660288;visibility:visible;mso-wrap-style:square;mso-wrap-distance-left:9pt;mso-wrap-distance-top:0;mso-wrap-distance-right:9pt;mso-wrap-distance-bottom:0;mso-position-horizontal:absolute;mso-position-horizontal-relative:text;mso-position-vertical:absolute;mso-position-vertical-relative:text" from="42.2pt,235.85pt" to="175.05pt,235.85pt" o:gfxdata="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" strokecolor="black [3200]" strokeweight="3pt">
+                <v:shadow on="t" color="black" opacity="22937f" origin=",.5" offset="0,.63889mm"/>
+              </v:line>
+            </w:pict>
+          </mc:Fallback>
+        </mc:AlternateContent>
+      </w:r>
+      <w:r>
+        <w:rPr>
+          <w:rFonts w:ascii="Lucida Bright" w:hAnsi="Lucida Bright"/>
+          <w:noProof/>
+          <w:sz w:val="36"/>
+          <w:szCs w:val="36"/>
+        </w:rPr>
+        <mc:AlternateContent>
+          <mc:Choice Requires="wps">
+            <w:drawing>
+              <wp:anchor distT="0" distB="0" distL="114300" distR="114300" simplePos="0" relativeHeight="251664384" behindDoc="0" locked="0" layoutInCell="1" allowOverlap="1" wp14:anchorId="7875B88C" wp14:editId="57857D5A">
+                <wp:simplePos x="0" y="0"/>
+                <wp:positionH relativeFrom="column">
+                  <wp:posOffset>4604385</wp:posOffset>
+                </wp:positionH>
+                <wp:positionV relativeFrom="paragraph">
+                  <wp:posOffset>2996474</wp:posOffset>
+                </wp:positionV>
+                <wp:extent cx="1687286" cy="0"/>
+                <wp:effectExtent l="57150" t="38100" r="65405" b="95250"/>
+                <wp:wrapNone/>
+                <wp:docPr id="1059584092" name="Straight Connector 9"/>
+                <wp:cNvGraphicFramePr/>
+                <a:graphic xmlns:a="http://schemas.openxmlformats.org/drawingml/2006/main">
+                  <a:graphicData uri="http://schemas.microsoft.com/office/word/2010/wordprocessingShape">
+                    <wps:wsp>
+                      <wps:cNvCnPr/>
+                      <wps:spPr>
+                        <a:xfrm>
+                          <a:off x="0" y="0"/>
+                          <a:ext cx="1687286" cy="0"/>
+                        </a:xfrm>
+                        <a:prstGeom prst="line">
+                          <a:avLst/>
+                        </a:prstGeom>
+                      </wps:spPr>
+                      <wps:style>
+                        <a:lnRef idx="3">
+                          <a:schemeClr val="dk1"/>
+                        </a:lnRef>
+                        <a:fillRef idx="0">
+                          <a:schemeClr val="dk1"/>
+                        </a:fillRef>
+                        <a:effectRef idx="2">
+                          <a:schemeClr val="dk1"/>
+                        </a:effectRef>
+                        <a:fontRef idx="minor">
+                          <a:schemeClr val="tx1"/>
+                        </a:fontRef>
+                      </wps:style>
+                      <wps:bodyPr/>
+                    </wps:wsp>
+                  </a:graphicData>
+                </a:graphic>
+              </wp:anchor>
+            </w:drawing>
+          </mc:Choice>
+          <mc:Fallback>
+            <w:pict>
+              <v:line w14:anchorId="63F12514" id="Straight Connector 9" o:spid="_x0000_s1026" style="position:absolute;left:0;text-align:left;z-index:251664384;visibility:visible;mso-wrap-style:square;mso-wrap-distance-left:9pt;mso-wrap-distance-top:0;mso-wrap-distance-right:9pt;mso-wrap-distance-bottom:0;mso-position-horizontal:absolute;mso-position-horizontal-relative:text;mso-position-vertical:absolute;mso-position-vertical-relative:text" from="362.55pt,235.95pt" to="495.4pt,235.95pt" o:gfxdata="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" strokecolor="black [3200]" strokeweight="3pt">
+                <v:shadow on="t" color="black" opacity="22937f" origin=",.5" offset="0,.63889mm"/>
+              </v:line>
+            </w:pict>
+          </mc:Fallback>
+        </mc:AlternateContent>
+      </w:r>
+      <w:r>
+        <w:rPr>
+          <w:rFonts w:ascii="Lucida Bright" w:hAnsi="Lucida Bright"/>
+          <w:noProof/>
+          <w:sz w:val="36"/>
+          <w:szCs w:val="36"/>
+        </w:rPr>
+        <w:drawing>
+          <wp:anchor distT="0" distB="0" distL="114300" distR="114300" simplePos="0" relativeHeight="251654144" behindDoc="0" locked="0" layoutInCell="1" allowOverlap="1" wp14:anchorId="2AFFD219" wp14:editId="35932DFC">
+            <wp:simplePos x="0" y="0"/>
+            <wp:positionH relativeFrom="column">
+              <wp:posOffset>4607016</wp:posOffset>
+            </wp:positionH>
+            <wp:positionV relativeFrom="paragraph">
+              <wp:posOffset>3469550</wp:posOffset>
+            </wp:positionV>
+            <wp:extent cx="2022838" cy="1136653"/>
+            <wp:effectExtent l="0" t="0" r="0" b="6350"/>
+            <wp:wrapNone/>
+            <wp:docPr id="825067895" name="Picture 5"/>
+            <wp:cNvGraphicFramePr>
+              <a:graphicFrameLocks xmlns:a="http://schemas.openxmlformats.org/drawingml/2006/main" noChangeAspect="1"/>
+            </wp:cNvGraphicFramePr>
+            <a:graphic xmlns:a="http://schemas.openxmlformats.org/drawingml/2006/main">
+              <a:graphicData uri="http://schemas.openxmlformats.org/drawingml/2006/picture">
+                <pic:pic xmlns:pic="http://schemas.openxmlformats.org/drawingml/2006/picture">
+                  <pic:nvPicPr>
+                    <pic:cNvPr id="0" name="Picture 5"/>
+                    <pic:cNvPicPr>
+                      <a:picLocks noChangeAspect="1" noChangeArrowheads="1"/>
+                    </pic:cNvPicPr>
+                  </pic:nvPicPr>
+                  <pic:blipFill>
+                    <a:blip r:embed="rId7" cstate="print">
+                      <a:extLst>
+                        <a:ext uri="{28A0092B-C50C-407E-A947-70E740481C1C}">
+                          <a14:useLocalDpi xmlns:a14="http://schemas.microsoft.com/office/drawing/2010/main" val="0"/>
+                        </a:ext>
+                      </a:extLst>
+                    </a:blip>
+                    <a:srcRect/>
+                    <a:stretch>
+                      <a:fillRect/>
+                    </a:stretch>
+                  </pic:blipFill>
+                  <pic:spPr bwMode="auto">
+                    <a:xfrm>
+                      <a:off x="0" y="0"/>
+                      <a:ext cx="2022838" cy="1136653"/>
+                    </a:xfrm>
+                    <a:prstGeom prst="rect">
+                      <a:avLst/>
+                    </a:prstGeom>
+                    <a:noFill/>
+                    <a:ln>
+                      <a:noFill/>
+                    </a:ln>
+                  </pic:spPr>
+                </pic:pic>
+              </a:graphicData>
+            </a:graphic>
+            <wp14:sizeRelH relativeFrom="margin">
+              <wp14:pctWidth>0</wp14:pctWidth>
+            </wp14:sizeRelH>
+            <wp14:sizeRelV relativeFrom="margin">
+              <wp14:pctHeight>0</wp14:pctHeight>
+            </wp14:sizeRelV>
+          </wp:anchor>
+        </w:drawing>
+      </w:r>
+      <w:r>
+        <w:rPr>
+          <w:rFonts w:ascii="Lucida Bright" w:hAnsi="Lucida Bright"/>
+          <w:noProof/>
+          <w:sz w:val="36"/>
+          <w:szCs w:val="36"/>
+        </w:rPr>
+        <mc:AlternateContent>
+          <mc:Choice Requires="wps">
+            <w:drawing>
+              <wp:anchor distT="0" distB="0" distL="114300" distR="114300" simplePos="0" relativeHeight="251662336" behindDoc="0" locked="0" layoutInCell="1" allowOverlap="1" wp14:anchorId="0124B21A" wp14:editId="76F687CD">
+                <wp:simplePos x="0" y="0"/>
+                <wp:positionH relativeFrom="column">
+                  <wp:posOffset>4607288</wp:posOffset>
+                </wp:positionH>
+                <wp:positionV relativeFrom="paragraph">
+                  <wp:posOffset>5124450</wp:posOffset>
+                </wp:positionV>
+                <wp:extent cx="1687286" cy="0"/>
+                <wp:effectExtent l="57150" t="38100" r="65405" b="95250"/>
+                <wp:wrapNone/>
+                <wp:docPr id="934568660" name="Straight Connector 9"/>
+                <wp:cNvGraphicFramePr/>
+                <a:graphic xmlns:a="http://schemas.openxmlformats.org/drawingml/2006/main">
+                  <a:graphicData uri="http://schemas.microsoft.com/office/word/2010/wordprocessingShape">
+                    <wps:wsp>
+                      <wps:cNvCnPr/>
+                      <wps:spPr>
+                        <a:xfrm>
+                          <a:off x="0" y="0"/>
+                          <a:ext cx="1687286" cy="0"/>
+                        </a:xfrm>
+                        <a:prstGeom prst="line">
+                          <a:avLst/>
+                        </a:prstGeom>
+                      </wps:spPr>
+                      <wps:style>
+                        <a:lnRef idx="3">
+                          <a:schemeClr val="dk1"/>
+                        </a:lnRef>
+                        <a:fillRef idx="0">
+                          <a:schemeClr val="dk1"/>
+                        </a:fillRef>
+                        <a:effectRef idx="2">
+                          <a:schemeClr val="dk1"/>
+                        </a:effectRef>
+                        <a:fontRef idx="minor">
+                          <a:schemeClr val="tx1"/>
+                        </a:fontRef>
+                      </wps:style>
+                      <wps:bodyPr/>
+                    </wps:wsp>
+                  </a:graphicData>
+                </a:graphic>
+              </wp:anchor>
+            </w:drawing>
+          </mc:Choice>
+          <mc:Fallback>
+            <w:pict>
+              <v:line w14:anchorId="54CC8BF2" id="Straight Connector 9" o:spid="_x0000_s1026" style="position:absolute;left:0;text-align:left;z-index:251662336;visibility:visible;mso-wrap-style:square;mso-wrap-distance-left:9pt;mso-wrap-distance-top:0;mso-wrap-distance-right:9pt;mso-wrap-distance-bottom:0;mso-position-horizontal:absolute;mso-position-horizontal-relative:text;mso-position-vertical:absolute;mso-position-vertical-relative:text" from="362.8pt,403.5pt" to="495.65pt,403.5pt" o:gfxdata="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" strokecolor="black [3200]" strokeweight="3pt">
+                <v:shadow on="t" color="black" opacity="22937f" origin=",.5" offset="0,.63889mm"/>
+              </v:line>
+            </w:pict>
+          </mc:Fallback>
+        </mc:AlternateContent>
+      </w:r>
+      <w:r>
+        <w:rPr>
+          <w:rFonts w:ascii="Lucida Bright" w:hAnsi="Lucida Bright"/>
+          <w:noProof/>
+          <w:sz w:val="36"/>
+          <w:szCs w:val="36"/>
+        </w:rPr>
+        <mc:AlternateContent>
+          <mc:Choice Requires="wps">
+            <w:drawing>
+              <wp:anchor distT="0" distB="0" distL="114300" distR="114300" simplePos="0" relativeHeight="251661824" behindDoc="0" locked="0" layoutInCell="1" allowOverlap="1" wp14:anchorId="7285D0FD" wp14:editId="61FF408C">
                 <wp:simplePos x="0" y="0"/>
                 <wp:positionH relativeFrom="column">
                   <wp:posOffset>601345</wp:posOffset>
@@ -1175,7 +1175,7 @@
           </mc:Choice>
           <mc:Fallback>
             <w:pict>
-              <v:line w14:anchorId="5AE7EE42" id="Straight Connector 9" o:spid="_x0000_s1026" style="position:absolute;left:0;text-align:left;z-index:251673600;visibility:visible;mso-wrap-style:square;mso-wrap-distance-left:9pt;mso-wrap-distance-top:0;mso-wrap-distance-right:9pt;mso-wrap-distance-bottom:0;mso-position-horizontal:absolute;mso-position-horizontal-relative:text;mso-position-vertical:absolute;mso-position-vertical-relative:text" from="47.35pt,403.5pt" to="180.2pt,403.5pt" o:gfxdata="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" strokecolor="black [3200]" strokeweight="3pt">
+              <v:line w14:anchorId="1A1687FF" id="Straight Connector 9" o:spid="_x0000_s1026" style="position:absolute;left:0;text-align:left;z-index:251661824;visibility:visible;mso-wrap-style:square;mso-wrap-distance-left:9pt;mso-wrap-distance-top:0;mso-wrap-distance-right:9pt;mso-wrap-distance-bottom:0;mso-position-horizontal:absolute;mso-position-horizontal-relative:text;mso-position-vertical:absolute;mso-position-vertical-relative:text" from="47.35pt,403.5pt" to="180.2pt,403.5pt" o:gfxdata="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" strokecolor="black [3200]" strokeweight="3pt">
                 <v:shadow on="t" color="black" opacity="22937f" origin=",.5" offset="0,.63889mm"/>
               </v:line>
             </w:pict>
@@ -1190,7 +1190,7 @@
           <w:szCs w:val="36"/>
         </w:rPr>
         <w:drawing>
-          <wp:anchor distT="0" distB="0" distL="114300" distR="114300" simplePos="0" relativeHeight="251640832" behindDoc="0" locked="0" layoutInCell="1" allowOverlap="1" wp14:anchorId="35759F31" wp14:editId="73FAC80E">
+          <wp:anchor distT="0" distB="0" distL="114300" distR="114300" simplePos="0" relativeHeight="251652608" behindDoc="0" locked="0" layoutInCell="1" allowOverlap="1" wp14:anchorId="35759F31" wp14:editId="73FAC80E">
             <wp:simplePos x="0" y="0"/>
             <wp:positionH relativeFrom="column">
               <wp:posOffset>655683</wp:posOffset>
@@ -1260,7 +1260,7 @@
           <w:szCs w:val="36"/>
         </w:rPr>
         <w:drawing>
-          <wp:anchor distT="0" distB="0" distL="114300" distR="114300" simplePos="0" relativeHeight="251649024" behindDoc="0" locked="0" layoutInCell="1" allowOverlap="1" wp14:anchorId="58954433" wp14:editId="16370E11">
+          <wp:anchor distT="0" distB="0" distL="114300" distR="114300" simplePos="0" relativeHeight="251654656" behindDoc="0" locked="0" layoutInCell="1" allowOverlap="1" wp14:anchorId="58954433" wp14:editId="16370E11">
             <wp:simplePos x="0" y="0"/>
             <wp:positionH relativeFrom="column">
               <wp:posOffset>711291</wp:posOffset>
@@ -1330,7 +1330,7 @@
           <w:szCs w:val="36"/>
         </w:rPr>
         <w:drawing>
-          <wp:anchor distT="0" distB="0" distL="114300" distR="114300" simplePos="0" relativeHeight="251653120" behindDoc="0" locked="0" layoutInCell="1" allowOverlap="1" wp14:anchorId="36E6624E" wp14:editId="06C221C8">
+          <wp:anchor distT="0" distB="0" distL="114300" distR="114300" simplePos="0" relativeHeight="251655680" behindDoc="0" locked="0" layoutInCell="1" allowOverlap="1" wp14:anchorId="36E6624E" wp14:editId="06C221C8">
             <wp:simplePos x="0" y="0"/>
             <wp:positionH relativeFrom="column">
               <wp:posOffset>4541611</wp:posOffset>
@@ -1402,7 +1402,7 @@
         <mc:AlternateContent>
           <mc:Choice Requires="wps">
             <w:drawing>
-              <wp:anchor distT="0" distB="0" distL="114300" distR="114300" simplePos="0" relativeHeight="251665408" behindDoc="0" locked="0" layoutInCell="1" allowOverlap="1" wp14:anchorId="2591037B" wp14:editId="0302A268">
+              <wp:anchor distT="0" distB="0" distL="114300" distR="114300" simplePos="0" relativeHeight="251659776" behindDoc="0" locked="0" layoutInCell="1" allowOverlap="1" wp14:anchorId="2591037B" wp14:editId="0302A268">
                 <wp:simplePos x="0" y="0"/>
                 <wp:positionH relativeFrom="column">
                   <wp:posOffset>4788535</wp:posOffset>
@@ -1479,7 +1479,7 @@
           </mc:Choice>
           <mc:Fallback>
             <w:pict>
-              <v:roundrect w14:anchorId="2591037B" id="_x0000_s1029" style="position:absolute;margin-left:377.05pt;margin-top:30.2pt;width:1in;height:36.85pt;z-index:251665408;visibility:visible;mso-wrap-style:square;mso-height-percent:0;mso-wrap-distance-left:9pt;mso-wrap-distance-top:0;mso-wrap-distance-right:9pt;mso-wrap-distance-bottom:0;mso-position-horizontal:absolute;mso-position-horizontal-relative:text;mso-position-vertical:absolute;mso-position-vertical-relative:text;mso-height-percent:0;mso-height-relative:margin;v-text-anchor:middle" arcsize="10923f" o:gfxdata="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" fillcolor="#4f81bd [3204]" strokecolor="#0a121c [484]" strokeweight="2pt">
+              <v:roundrect w14:anchorId="2591037B" id="_x0000_s1029" style="position:absolute;margin-left:377.05pt;margin-top:30.2pt;width:1in;height:36.85pt;z-index:251659776;visibility:visible;mso-wrap-style:square;mso-height-percent:0;mso-wrap-distance-left:9pt;mso-wrap-distance-top:0;mso-wrap-distance-right:9pt;mso-wrap-distance-bottom:0;mso-position-horizontal:absolute;mso-position-horizontal-relative:text;mso-position-vertical:absolute;mso-position-vertical-relative:text;mso-height-percent:0;mso-height-relative:margin;v-text-anchor:middle" arcsize="10923f" o:gfxdata="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" fillcolor="#4f81bd [3204]" strokecolor="#0a121c [484]" strokeweight="2pt">
                 <v:textbox>
                   <w:txbxContent>
                     <w:p>
@@ -1513,7 +1513,7 @@
         <mc:AlternateContent>
           <mc:Choice Requires="wps">
             <w:drawing>
-              <wp:anchor distT="0" distB="0" distL="114300" distR="114300" simplePos="0" relativeHeight="251657216" behindDoc="0" locked="0" layoutInCell="1" allowOverlap="1" wp14:anchorId="688EA53D" wp14:editId="6F550D70">
+              <wp:anchor distT="0" distB="0" distL="114300" distR="114300" simplePos="0" relativeHeight="251656704" behindDoc="0" locked="0" layoutInCell="1" allowOverlap="1" wp14:anchorId="688EA53D" wp14:editId="6F550D70">
                 <wp:simplePos x="0" y="0"/>
                 <wp:positionH relativeFrom="column">
                   <wp:posOffset>902970</wp:posOffset>
@@ -1590,7 +1590,7 @@
           </mc:Choice>
           <mc:Fallback>
             <w:pict>
-              <v:roundrect w14:anchorId="688EA53D" id="_x0000_s1030" style="position:absolute;margin-left:71.1pt;margin-top:30.2pt;width:1in;height:36.85pt;z-index:251657216;visibility:visible;mso-wrap-style:square;mso-height-percent:0;mso-wrap-distance-left:9pt;mso-wrap-distance-top:0;mso-wrap-distance-right:9pt;mso-wrap-distance-bottom:0;mso-position-horizontal:absolute;mso-position-horizontal-relative:text;mso-position-vertical:absolute;mso-position-vertical-relative:text;mso-height-percent:0;mso-height-relative:margin;v-text-anchor:middle" arcsize="10923f" o:gfxdata="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" fillcolor="#4f81bd [3204]" strokecolor="#0a121c [484]" strokeweight="2pt">
+              <v:roundrect w14:anchorId="688EA53D" id="_x0000_s1030" style="position:absolute;margin-left:71.1pt;margin-top:30.2pt;width:1in;height:36.85pt;z-index:251656704;visibility:visible;mso-wrap-style:square;mso-height-percent:0;mso-wrap-distance-left:9pt;mso-wrap-distance-top:0;mso-wrap-distance-right:9pt;mso-wrap-distance-bottom:0;mso-position-horizontal:absolute;mso-position-horizontal-relative:text;mso-position-vertical:absolute;mso-position-vertical-relative:text;mso-height-percent:0;mso-height-relative:margin;v-text-anchor:middle" arcsize="10923f" o:gfxdata="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" fillcolor="#4f81bd [3204]" strokecolor="#0a121c [484]" strokeweight="2pt">
                 <v:textbox>
                   <w:txbxContent>
                     <w:p>
@@ -2139,6 +2139,7 @@
   <w:style w:type="character" w:default="1" w:styleId="DefaultParagraphFont">
     <w:name w:val="Default Paragraph Font"/>
     <w:uiPriority w:val="1"/>
+    <w:semiHidden/>
     <w:unhideWhenUsed/>
   </w:style>
   <w:style w:type="table" w:default="1" w:styleId="TableNormal">

</xml_diff>